<commit_message>
Updated via the Open Science Framework
</commit_message>
<xml_diff>
--- a/Online-Supplement/HPC-details/HPC-Details.docx
+++ b/Online-Supplement/HPC-details/HPC-Details.docx
@@ -1,6 +1,6 @@
 
 <file path=word/document.xml><?xml version="1.0" encoding="utf-8"?>
-<w:document xmlns:wpc="http://schemas.microsoft.com/office/word/2010/wordprocessingCanvas" xmlns:cx="http://schemas.microsoft.com/office/drawing/2014/chartex" xmlns:cx1="http://schemas.microsoft.com/office/drawing/2015/9/8/chartex" xmlns:cx2="http://schemas.microsoft.com/office/drawing/2015/10/21/chartex" xmlns:cx3="http://schemas.microsoft.com/office/drawing/2016/5/9/chartex" xmlns:cx4="http://schemas.microsoft.com/office/drawing/2016/5/10/chartex" xmlns:cx5="http://schemas.microsoft.com/office/drawing/2016/5/11/chartex" xmlns:cx6="http://schemas.microsoft.com/office/drawing/2016/5/12/chartex" xmlns:cx7="http://schemas.microsoft.com/office/drawing/2016/5/13/chartex" xmlns:cx8="http://schemas.microsoft.com/office/drawing/2016/5/14/chartex" xmlns:mc="http://schemas.openxmlformats.org/markup-compatibility/2006" xmlns:aink="http://schemas.microsoft.com/office/drawing/2016/ink" xmlns:am3d="http://schemas.microsoft.com/office/drawing/2017/model3d" xmlns:o="urn:schemas-microsoft-com:office:office" xmlns:oel="http://schemas.microsoft.com/office/2019/extlst" xmlns:r="http://schemas.openxmlformats.org/officeDocument/2006/relationships" xmlns:m="http://schemas.openxmlformats.org/officeDocument/2006/math" xmlns:v="urn:schemas-microsoft-com:vml" xmlns:wp14="http://schemas.microsoft.com/office/word/2010/wordprocessingDrawing" xmlns:wp="http://schemas.openxmlformats.org/drawingml/2006/wordprocessingDrawing" xmlns:w10="urn:schemas-microsoft-com:office:word" xmlns:w="http://schemas.openxmlformats.org/wordprocessingml/2006/main" xmlns:w14="http://schemas.microsoft.com/office/word/2010/wordml" xmlns:w15="http://schemas.microsoft.com/office/word/2012/wordml" xmlns:w16cex="http://schemas.microsoft.com/office/word/2018/wordml/cex" xmlns:w16cid="http://schemas.microsoft.com/office/word/2016/wordml/cid" xmlns:w16="http://schemas.microsoft.com/office/word/2018/wordml" xmlns:w16du="http://schemas.microsoft.com/office/word/2023/wordml/word16du" xmlns:w16sdtdh="http://schemas.microsoft.com/office/word/2020/wordml/sdtdatahash" xmlns:w16sdtfl="http://schemas.microsoft.com/office/word/2024/wordml/sdtformatlock" xmlns:w16se="http://schemas.microsoft.com/office/word/2015/wordml/symex" xmlns:wpg="http://schemas.microsoft.com/office/word/2010/wordprocessingGroup" xmlns:wpi="http://schemas.microsoft.com/office/word/2010/wordprocessingInk" xmlns:wne="http://schemas.microsoft.com/office/word/2006/wordml" xmlns:wps="http://schemas.microsoft.com/office/word/2010/wordprocessingShape" mc:Ignorable="w14 w15 w16se w16cid w16 w16cex w16sdtdh w16sdtfl w16du wp14">
+<w:document xmlns:wpc="http://schemas.microsoft.com/office/word/2010/wordprocessingCanvas" xmlns:cx="http://schemas.microsoft.com/office/drawing/2014/chartex" xmlns:cx1="http://schemas.microsoft.com/office/drawing/2015/9/8/chartex" xmlns:cx2="http://schemas.microsoft.com/office/drawing/2015/10/21/chartex" xmlns:cx3="http://schemas.microsoft.com/office/drawing/2016/5/9/chartex" xmlns:cx4="http://schemas.microsoft.com/office/drawing/2016/5/10/chartex" xmlns:cx5="http://schemas.microsoft.com/office/drawing/2016/5/11/chartex" xmlns:cx6="http://schemas.microsoft.com/office/drawing/2016/5/12/chartex" xmlns:cx7="http://schemas.microsoft.com/office/drawing/2016/5/13/chartex" xmlns:cx8="http://schemas.microsoft.com/office/drawing/2016/5/14/chartex" xmlns:mc="http://schemas.openxmlformats.org/markup-compatibility/2006" xmlns:m="http://schemas.openxmlformats.org/officeDocument/2006/math" xmlns:aink="http://schemas.microsoft.com/office/drawing/2016/ink" xmlns:am3d="http://schemas.microsoft.com/office/drawing/2017/model3d" xmlns:oel="http://schemas.microsoft.com/office/2019/extlst" xmlns:r="http://schemas.openxmlformats.org/officeDocument/2006/relationships" xmlns:wp14="http://schemas.microsoft.com/office/word/2010/wordprocessingDrawing" xmlns:wp="http://schemas.openxmlformats.org/drawingml/2006/wordprocessingDrawing" xmlns:wpg="http://schemas.microsoft.com/office/word/2010/wordprocessingGroup" xmlns:wpi="http://schemas.microsoft.com/office/word/2010/wordprocessingInk" xmlns:wps="http://schemas.microsoft.com/office/word/2010/wordprocessingShape" xmlns:o="urn:schemas-microsoft-com:office:office" xmlns:v="urn:schemas-microsoft-com:vml" xmlns:w10="urn:schemas-microsoft-com:office:word" xmlns:w="http://schemas.openxmlformats.org/wordprocessingml/2006/main" xmlns:w14="http://schemas.microsoft.com/office/word/2010/wordml" xmlns:w15="http://schemas.microsoft.com/office/word/2012/wordml" xmlns:w16cex="http://schemas.microsoft.com/office/word/2018/wordml/cex" xmlns:w16cid="http://schemas.microsoft.com/office/word/2016/wordml/cid" xmlns:w16="http://schemas.microsoft.com/office/word/2018/wordml" xmlns:w16sdtdh="http://schemas.microsoft.com/office/word/2020/wordml/sdtdatahash" xmlns:w16sdtfl="http://schemas.microsoft.com/office/word/2024/wordml/sdtformatlock" xmlns:w16se="http://schemas.microsoft.com/office/word/2015/wordml/symex" xmlns:w16du="http://schemas.microsoft.com/office/word/2023/wordml/word16du" xmlns:wne="http://schemas.microsoft.com/office/word/2006/wordml" mc:Ignorable="w14 w15 w16se w16cid w16 w16cex w16sdtdh w16sdtfl w16du wp14">
   <w:body>
     <w:p>
       <w:pPr>
@@ -139,6 +139,43 @@
         <w:rPr>
           <w:rFonts w:ascii="Times New Roman" w:hAnsi="Times New Roman" w:cs="Times New Roman"/>
         </w:rPr>
+        <w:t xml:space="preserve">Across studies, we divided analyses into smaller jobs to accommodate HPC time limits: Study 1 involved two FP analyses, whereas Studies 2 and 3 required </w:t>
+      </w:r>
+      <w:proofErr w:type="gramStart"/>
+      <w:r>
+        <w:rPr>
+          <w:rFonts w:ascii="Times New Roman" w:hAnsi="Times New Roman" w:cs="Times New Roman"/>
+        </w:rPr>
+        <w:t>estimation</w:t>
+      </w:r>
+      <w:proofErr w:type="gramEnd"/>
+      <w:r>
+        <w:rPr>
+          <w:rFonts w:ascii="Times New Roman" w:hAnsi="Times New Roman" w:cs="Times New Roman"/>
+        </w:rPr>
+        <w:t xml:space="preserve"> of each model-by-condition combination separately, yielding 48 FP analyses (details below). For these studies, we further partitioned each analysis to generate and evaluate 25,000 correlation matrices at a time. We used a set of seeds to ensure consistency in the generated matrices across models and conditions where appropriate.</w:t>
+      </w:r>
+    </w:p>
+    <w:p>
+      <w:pPr>
+        <w:spacing w:line="480" w:lineRule="auto"/>
+        <w:rPr>
+          <w:rFonts w:ascii="Times New Roman" w:hAnsi="Times New Roman" w:cs="Times New Roman"/>
+        </w:rPr>
+      </w:pPr>
+    </w:p>
+    <w:p>
+      <w:pPr>
+        <w:spacing w:line="480" w:lineRule="auto"/>
+        <w:rPr>
+          <w:rFonts w:ascii="Times New Roman" w:hAnsi="Times New Roman" w:cs="Times New Roman"/>
+        </w:rPr>
+      </w:pPr>
+      <w:r>
+        <w:rPr>
+          <w:rFonts w:ascii="Times New Roman" w:hAnsi="Times New Roman" w:cs="Times New Roman"/>
+        </w:rPr>
+        <w:lastRenderedPageBreak/>
         <w:t xml:space="preserve">The computation for this work was performed on the high-performance computing infrastructure operated by Research Support Solutions in the Division of Information Technology at the University of Missouri, Columbia, MO. Additional information about the Hellbender HPC infrastructure is available at </w:t>
       </w:r>
       <w:hyperlink r:id="rId4" w:history="1">
@@ -169,7 +206,7 @@
 </file>
 
 <file path=word/styles.xml><?xml version="1.0" encoding="utf-8"?>
-<w:styles xmlns:mc="http://schemas.openxmlformats.org/markup-compatibility/2006" xmlns:r="http://schemas.openxmlformats.org/officeDocument/2006/relationships" xmlns:w="http://schemas.openxmlformats.org/wordprocessingml/2006/main" xmlns:w14="http://schemas.microsoft.com/office/word/2010/wordml" xmlns:w15="http://schemas.microsoft.com/office/word/2012/wordml" xmlns:w16cex="http://schemas.microsoft.com/office/word/2018/wordml/cex" xmlns:w16cid="http://schemas.microsoft.com/office/word/2016/wordml/cid" xmlns:w16="http://schemas.microsoft.com/office/word/2018/wordml" xmlns:w16du="http://schemas.microsoft.com/office/word/2023/wordml/word16du" xmlns:w16sdtdh="http://schemas.microsoft.com/office/word/2020/wordml/sdtdatahash" xmlns:w16sdtfl="http://schemas.microsoft.com/office/word/2024/wordml/sdtformatlock" xmlns:w16se="http://schemas.microsoft.com/office/word/2015/wordml/symex" mc:Ignorable="w14 w15 w16se w16cid w16 w16cex w16sdtdh w16sdtfl w16du">
+<w:styles xmlns:mc="http://schemas.openxmlformats.org/markup-compatibility/2006" xmlns:r="http://schemas.openxmlformats.org/officeDocument/2006/relationships" xmlns:w="http://schemas.openxmlformats.org/wordprocessingml/2006/main" xmlns:w14="http://schemas.microsoft.com/office/word/2010/wordml" xmlns:w15="http://schemas.microsoft.com/office/word/2012/wordml" xmlns:w16cex="http://schemas.microsoft.com/office/word/2018/wordml/cex" xmlns:w16cid="http://schemas.microsoft.com/office/word/2016/wordml/cid" xmlns:w16="http://schemas.microsoft.com/office/word/2018/wordml" xmlns:w16sdtdh="http://schemas.microsoft.com/office/word/2020/wordml/sdtdatahash" xmlns:w16sdtfl="http://schemas.microsoft.com/office/word/2024/wordml/sdtformatlock" xmlns:w16se="http://schemas.microsoft.com/office/word/2015/wordml/symex" xmlns:w16du="http://schemas.microsoft.com/office/word/2023/wordml/word16du" mc:Ignorable="w14 w15 w16se w16cid w16 w16cex w16sdtdh w16sdtfl w16du">
   <w:docDefaults>
     <w:rPrDefault>
       <w:rPr>

</xml_diff>